<commit_message>
Refine all-variant analysis: clean OR/WA samples, level-vs-bias model, UT diagnosis
Fixed hardcoded sample seed: OR/WA variants (BM/EC/PN/WC) had a pathological draw
inflating RMSE to ~98%; clean multi-sample values are ~47-50% and near-neutral. Conclusion
holds: calibrated <= native in 19/20, level 0.6-2.0 (median 1.2). Added level-vs-native-bias
model (r=-0.35: the level compensates for native mortality) and the Utah exception (weakest
self-thinning signal, drought-governed). Updated report, deck, doc, figures.
</commit_message>
<xml_diff>
--- a/calibration/sdimax/FVS_team_REPORT_3step_plan.docx
+++ b/calibration/sdimax/FVS_team_REPORT_3step_plan.docx
@@ -2302,6 +2302,14 @@
           <w:szCs w:val="18"/>
         </w:rPr>
         <w:t xml:space="preserve">Figure 3. Per-variant level calibration across all 20 CONUS variants. Left: calibrated is at or below native in 19 of 20. Right: the optimal level is variant-specific, 0.6 to 2.0, median 1.2.</w:t>
+      </w:r>
+    </w:p>
+    <w:p>
+      <w:pPr>
+        <w:spacing w:after="140" w:line="276"/>
+      </w:pPr>
+      <w:r>
+        <w:t xml:space="preserve">The required level is partly predictable from each variant's native bias: variants whose native mortality over-thins need the localized maximum scaled up, and the two that over-retain (Central Rockies and Utah) sit near the raw level (correlation about -0.35). The level compensates for the variant's mortality calibration, which is why it must be estimated jointly with mortality. Two qualifications: where the ceiling does not strongly bind, such as the Pacific Northwest and other Oregon and Washington variants, the localized maximum is roughly neutral (native and calibrated within about a point); and Utah is a genuine exception, with the weakest self-thinning signal of any region and a native configuration that already under-thins, so its density is governed by drought rather than the ceiling.</w:t>
       </w:r>
     </w:p>
     <w:p>

</xml_diff>

<commit_message>
Add Batista et al. 2026 corroboration (independent FVS-WS tree-ring benchmark)
Independent FEM paper (online 11 Jun 2026): FVS-WS underpredicts DG ~41%, fixed by
multiplicative calibration (RMSE 66->12%), error driven by size/density not climate,
and concludes flexible size-dependent equations are needed next. Corroborates all three
steps. Folded into the single FVS-team document and the technical report; adds relevance memo.
</commit_message>
<xml_diff>
--- a/calibration/sdimax/FVS_team_REPORT_3step_plan.docx
+++ b/calibration/sdimax/FVS_team_REPORT_3step_plan.docx
@@ -2919,6 +2919,30 @@
       </w:tr>
     </w:tbl>
     <w:p>
+      <w:pPr>
+        <w:pStyle w:val="Heading1"/>
+      </w:pPr>
+      <w:r>
+        <w:t xml:space="preserve">Independent corroboration</w:t>
+      </w:r>
+    </w:p>
+    <w:p>
+      <w:pPr>
+        <w:spacing w:after="140" w:line="276"/>
+      </w:pPr>
+      <w:r>
+        <w:t xml:space="preserve">A study published in Forest Ecology and Management in June 2026 (Batista et al.) corroborates this program end to end, and is worth flagging because it uses an independent ground-truth dataset. The authors benchmarked the FVS Western Sierra Nevada variant's diameter growth against tree-ring reconstructions plus FIA over 40 years (1,016 trees, 128 plots, four conifers) and found the default variant underpredicts diameter growth by about 41 percent (RMSE 66 percent relative), worst for large trees and in dense, high quadratic-mean-diameter stands.</w:t>
+      </w:r>
+    </w:p>
+    <w:p>
+      <w:pPr>
+        <w:spacing w:after="140" w:line="276"/>
+      </w:pPr>
+      <w:r>
+        <w:t xml:space="preserve">Their fix and findings map directly onto the three steps. A species-specific multiplicative calibration cut RMSE to 12 percent and bias to about -3 percent and raised the share of accurate predictions sevenfold, which is independent, tree-ring-validated evidence for Step 1 (calibration modifiers). They find the error scales with quadratic mean diameter and stand density rather than climate or topography, the same structural axis Step 2 (the density limit) targets. And their explicit conclusion is that calibration helps but that more flexible size-dependent equations are needed for further gains, which is Step 3 (the trait-driven, structure-based CONUS refit) stated by an independent group. The Western Sierra Nevada variant they study is one of the 20 we evaluated, and was among the more poorly calibrated. A complementary opportunity their method suggests is pairing tree-ring increment data with the species-free diameter-growth equation where cores exist, an independent high-resolution check on the growth channel for large trees, where FIA remeasurement is coarsest and the default is most biased.</w:t>
+      </w:r>
+    </w:p>
+    <w:p>
       <w:r>
         <w:br w:type="page"/>
       </w:r>
@@ -3031,6 +3055,18 @@
       </w:pPr>
       <w:r>
         <w:t xml:space="preserve">Selected references</w:t>
+      </w:r>
+    </w:p>
+    <w:p>
+      <w:pPr>
+        <w:spacing w:after="100"/>
+      </w:pPr>
+      <w:r>
+        <w:rPr>
+          <w:sz w:val="18"/>
+          <w:szCs w:val="18"/>
+        </w:rPr>
+        <w:t xml:space="preserve">Batista, E.K.L., J.D. Birch, M. Dickinson, C.M. Hoffman, J.A. Lutz, and J.R. Miesel. 2026. Benchmarking and calibrating FVS diameter growth predictions with tree-rings and forest inventory data in Sierra Nevada mixed-conifer forests. Forest Ecology and Management 618:123981. https://doi.org/10.1016/j.foreco.2026.123981</w:t>
       </w:r>
     </w:p>
     <w:p>

</xml_diff>

<commit_message>
Reframe Batista 2026 as directional related work, not validation
Correct overstatement: tree-ring growth reconstructions are biased high (survivorship/
large-tree selection), so the -41% underprediction is partly a benchmark artifact; and our
DG calibration already uses FIA remeasurement, the less-biased population-representative
reference. Reframed the doc section as related work with these qualifications; updated memo.
</commit_message>
<xml_diff>
--- a/calibration/sdimax/FVS_team_REPORT_3step_plan.docx
+++ b/calibration/sdimax/FVS_team_REPORT_3step_plan.docx
@@ -2923,7 +2923,7 @@
         <w:pStyle w:val="Heading1"/>
       </w:pPr>
       <w:r>
-        <w:t xml:space="preserve">Independent corroboration</w:t>
+        <w:t xml:space="preserve">Related work, and why FIA remeasurement is the reference</w:t>
       </w:r>
     </w:p>
     <w:p>
@@ -2931,7 +2931,7 @@
         <w:spacing w:after="140" w:line="276"/>
       </w:pPr>
       <w:r>
-        <w:t xml:space="preserve">A study published in Forest Ecology and Management in June 2026 (Batista et al.) corroborates this program end to end, and is worth flagging because it uses an independent ground-truth dataset. The authors benchmarked the FVS Western Sierra Nevada variant's diameter growth against tree-ring reconstructions plus FIA over 40 years (1,016 trees, 128 plots, four conifers) and found the default variant underpredicts diameter growth by about 41 percent (RMSE 66 percent relative), worst for large trees and in dense, high quadratic-mean-diameter stands.</w:t>
+        <w:t xml:space="preserve">A study published in Forest Ecology and Management in June 2026 (Batista et al.) benchmarked the FVS Western Sierra Nevada variant's diameter growth against tree-ring reconstructions plus FIA and reported the default underpredicts diameter growth by about 41 percent, worst for large trees and in dense stands, and that a species-specific multiplicative calibration largely removes the bias. The qualitative pattern aligns with this program: systematic, structure-dependent bias in a regional variant, a multiplicative calibration that corrects it, and an explicit call for more flexible size-dependent equations, which is Step 3.</w:t>
       </w:r>
     </w:p>
     <w:p>
@@ -2939,7 +2939,7 @@
         <w:spacing w:after="140" w:line="276"/>
       </w:pPr>
       <w:r>
-        <w:t xml:space="preserve">Their fix and findings map directly onto the three steps. A species-specific multiplicative calibration cut RMSE to 12 percent and bias to about -3 percent and raised the share of accurate predictions sevenfold, which is independent, tree-ring-validated evidence for Step 1 (calibration modifiers). They find the error scales with quadratic mean diameter and stand density rather than climate or topography, the same structural axis Step 2 (the density limit) targets. And their explicit conclusion is that calibration helps but that more flexible size-dependent equations are needed for further gains, which is Step 3 (the trait-driven, structure-based CONUS refit) stated by an independent group. The Western Sierra Nevada variant they study is one of the 20 we evaluated, and was among the more poorly calibrated. A complementary opportunity their method suggests is pairing tree-ring increment data with the species-free diameter-growth equation where cores exist, an independent high-resolution check on the growth channel for large trees, where FIA remeasurement is coarsest and the default is most biased.</w:t>
+        <w:t xml:space="preserve">Two qualifications matter, however, and are the reason this program calibrates on FIA remeasurement rather than tree rings. First, tree-ring reconstructions are a biased measure of population growth: increment cores are taken from trees that survived to be measured, so the sample over-represents fast-growing large survivors and underrepresents the suppressed trees that died small, and back-calculating diameter from those cores reconstructs a growth trajectory that is systematically too high for the population (the survivorship, or large-tree selection, bias). The reported 41 percent underprediction is therefore partly an artifact of a benchmark that is itself biased upward, not a clean property of the variant. Second, this program already calibrated FVS diameter growth on FIA remeasurement, which directly measures diameter change on every tagged tree over the interval, including the trees that die, and is population-representative and actually measured. FIA remeasurement is the less-biased reference for the growth channel, so the external study corroborates the direction and the calibration philosophy but does not add to, and uses a weaker reference than, the diameter-growth calibration already in place here.</w:t>
       </w:r>
     </w:p>
     <w:p>

</xml_diff>

<commit_message>
Stress test + honesty pass on materials and implementation status
Adversarial review of all claims: max-SDI self-thinning result is most robust but a relative
gain on a weak signal; all-variant magnitudes need multi-seed reruns (fixed-seed bug);
calibration coverage is partial (mortality all variants, growth partial/absent); NE benchmark
needs re-verification; injection untested. Reworded deck + document to true strength; added
stress-test and implementation-status memos.
</commit_message>
<xml_diff>
--- a/calibration/sdimax/FVS_team_REPORT_3step_plan.docx
+++ b/calibration/sdimax/FVS_team_REPORT_3step_plan.docx
@@ -217,7 +217,7 @@
         <w:spacing w:after="140" w:line="276"/>
       </w:pPr>
       <w:r>
-        <w:t xml:space="preserve">Step 1 layers FIA-derived calibration modifiers onto the existing FVS engine, the basis of our fvs-modern work, and already beats the regional Northeast and Acadian variants on basal area. Step 2 replaces the species-weighted maximum SDI with a localized, FIA-derived one, jointly calibrated with mortality, to improve long-term density and self-thinning, and we have validated this across all 20 CONUS variants. Step 3 refits the component equations as a single trait-aware CONUS variant covering all species, retiring the 20 separately maintained regional variants; the components are built and engine integration is the next task.</w:t>
+        <w:t xml:space="preserve">Step 1 layers FIA-derived calibration modifiers onto the existing FVS engine, the basis of our fvs-modern work. The calibration framework is in place for all 25 variants, with per-species mortality, crown, and height-diameter multipliers populated everywhere and the growth multipliers still being completed; an early Northeast benchmark is encouraging and is being re-verified. Step 2 would replace the species-weighted maximum SDI with a localized, FIA-derived one, calibrated jointly with mortality; this is validated in analysis as a better predictor of observed self-thinning but is not yet in the production configuration. Step 3 refits the component equations as a single trait-aware CONUS variant covering all species; the equations are fit and banked, and the engine injection is prototyped and not yet merged. This document states each step at its current, honest strength.</w:t>
       </w:r>
     </w:p>
     <w:tbl>
@@ -233,9 +233,9 @@
         </w:tblBorders>
       </w:tblPr>
       <w:tblGrid>
-        <w:gridCol w:w="3120"/>
-        <w:gridCol w:w="3120"/>
-        <w:gridCol w:w="3120"/>
+        <w:gridCol w:w="2400"/>
+        <w:gridCol w:w="3600"/>
+        <w:gridCol w:w="3360"/>
       </w:tblGrid>
       <w:tr>
         <w:trPr>
@@ -243,7 +243,7 @@
         </w:trPr>
         <w:tc>
           <w:tcPr>
-            <w:tcW w:type="dxa" w:w="3120"/>
+            <w:tcW w:type="dxa" w:w="2400"/>
             <w:shd w:fill="1A3D28" w:val="clear"/>
             <w:tcMar>
               <w:top w:type="dxa" w:w="60"/>
@@ -267,7 +267,7 @@
         </w:tc>
         <w:tc>
           <w:tcPr>
-            <w:tcW w:type="dxa" w:w="3120"/>
+            <w:tcW w:type="dxa" w:w="3600"/>
             <w:shd w:fill="1A3D28" w:val="clear"/>
             <w:tcMar>
               <w:top w:type="dxa" w:w="60"/>
@@ -291,7 +291,7 @@
         </w:tc>
         <w:tc>
           <w:tcPr>
-            <w:tcW w:type="dxa" w:w="3120"/>
+            <w:tcW w:type="dxa" w:w="3360"/>
             <w:shd w:fill="1A3D28" w:val="clear"/>
             <w:tcMar>
               <w:top w:type="dxa" w:w="60"/>
@@ -309,7 +309,7 @@
                 <w:sz w:val="18"/>
                 <w:szCs w:val="18"/>
               </w:rPr>
-              <w:t xml:space="preserve">Status</w:t>
+              <w:t xml:space="preserve">Status (honest)</w:t>
             </w:r>
           </w:p>
         </w:tc>
@@ -317,7 +317,7 @@
       <w:tr>
         <w:tc>
           <w:tcPr>
-            <w:tcW w:type="dxa" w:w="3120"/>
+            <w:tcW w:type="dxa" w:w="2400"/>
             <w:tcMar>
               <w:top w:type="dxa" w:w="50"/>
               <w:left w:type="dxa" w:w="110"/>
@@ -340,7 +340,7 @@
         </w:tc>
         <w:tc>
           <w:tcPr>
-            <w:tcW w:type="dxa" w:w="3120"/>
+            <w:tcW w:type="dxa" w:w="3600"/>
             <w:tcMar>
               <w:top w:type="dxa" w:w="50"/>
               <w:left w:type="dxa" w:w="110"/>
@@ -363,24 +363,24 @@
         </w:tc>
         <w:tc>
           <w:tcPr>
-            <w:tcW w:type="dxa" w:w="3120"/>
-            <w:tcMar>
-              <w:top w:type="dxa" w:w="50"/>
-              <w:left w:type="dxa" w:w="110"/>
-              <w:bottom w:type="dxa" w:w="50"/>
-              <w:right w:type="dxa" w:w="110"/>
-            </w:tcMar>
-          </w:tcPr>
-          <w:p>
-            <w:r>
-              <w:rPr>
-                <w:b w:val="false"/>
-                <w:bCs w:val="false"/>
-                <w:color w:val="1A3D28"/>
-                <w:sz w:val="18"/>
-                <w:szCs w:val="18"/>
-              </w:rPr>
-              <w:t xml:space="preserve">working, benchmarked</w:t>
+            <w:tcW w:type="dxa" w:w="3360"/>
+            <w:tcMar>
+              <w:top w:type="dxa" w:w="50"/>
+              <w:left w:type="dxa" w:w="110"/>
+              <w:bottom w:type="dxa" w:w="50"/>
+              <w:right w:type="dxa" w:w="110"/>
+            </w:tcMar>
+          </w:tcPr>
+          <w:p>
+            <w:r>
+              <w:rPr>
+                <w:b w:val="false"/>
+                <w:bCs w:val="false"/>
+                <w:color w:val="8a6d1f"/>
+                <w:sz w:val="18"/>
+                <w:szCs w:val="18"/>
+              </w:rPr>
+              <w:t xml:space="preserve">mortality, crown, height-diameter calibrated for all 25 variants; growth partial (DG ~7 variants, HG pending)</w:t>
             </w:r>
           </w:p>
         </w:tc>
@@ -388,7 +388,7 @@
       <w:tr>
         <w:tc>
           <w:tcPr>
-            <w:tcW w:type="dxa" w:w="3120"/>
+            <w:tcW w:type="dxa" w:w="2400"/>
             <w:tcMar>
               <w:top w:type="dxa" w:w="50"/>
               <w:left w:type="dxa" w:w="110"/>
@@ -411,7 +411,7 @@
         </w:tc>
         <w:tc>
           <w:tcPr>
-            <w:tcW w:type="dxa" w:w="3120"/>
+            <w:tcW w:type="dxa" w:w="3600"/>
             <w:tcMar>
               <w:top w:type="dxa" w:w="50"/>
               <w:left w:type="dxa" w:w="110"/>
@@ -434,24 +434,24 @@
         </w:tc>
         <w:tc>
           <w:tcPr>
-            <w:tcW w:type="dxa" w:w="3120"/>
-            <w:tcMar>
-              <w:top w:type="dxa" w:w="50"/>
-              <w:left w:type="dxa" w:w="110"/>
-              <w:bottom w:type="dxa" w:w="50"/>
-              <w:right w:type="dxa" w:w="110"/>
-            </w:tcMar>
-          </w:tcPr>
-          <w:p>
-            <w:r>
-              <w:rPr>
-                <w:b w:val="false"/>
-                <w:bCs w:val="false"/>
-                <w:color w:val="1A3D28"/>
-                <w:sz w:val="18"/>
-                <w:szCs w:val="18"/>
-              </w:rPr>
-              <w:t xml:space="preserve">validated, 20 variants</w:t>
+            <w:tcW w:type="dxa" w:w="3360"/>
+            <w:tcMar>
+              <w:top w:type="dxa" w:w="50"/>
+              <w:left w:type="dxa" w:w="110"/>
+              <w:bottom w:type="dxa" w:w="50"/>
+              <w:right w:type="dxa" w:w="110"/>
+            </w:tcMar>
+          </w:tcPr>
+          <w:p>
+            <w:r>
+              <w:rPr>
+                <w:b w:val="false"/>
+                <w:bCs w:val="false"/>
+                <w:color w:val="8a6d1f"/>
+                <w:sz w:val="18"/>
+                <w:szCs w:val="18"/>
+              </w:rPr>
+              <w:t xml:space="preserve">validated in analysis; not yet in production config; adopt jointly with mortality</w:t>
             </w:r>
           </w:p>
         </w:tc>
@@ -459,7 +459,7 @@
       <w:tr>
         <w:tc>
           <w:tcPr>
-            <w:tcW w:type="dxa" w:w="3120"/>
+            <w:tcW w:type="dxa" w:w="2400"/>
             <w:tcMar>
               <w:top w:type="dxa" w:w="50"/>
               <w:left w:type="dxa" w:w="110"/>
@@ -482,7 +482,7 @@
         </w:tc>
         <w:tc>
           <w:tcPr>
-            <w:tcW w:type="dxa" w:w="3120"/>
+            <w:tcW w:type="dxa" w:w="3600"/>
             <w:tcMar>
               <w:top w:type="dxa" w:w="50"/>
               <w:left w:type="dxa" w:w="110"/>
@@ -505,7 +505,7 @@
         </w:tc>
         <w:tc>
           <w:tcPr>
-            <w:tcW w:type="dxa" w:w="3120"/>
+            <w:tcW w:type="dxa" w:w="3360"/>
             <w:tcMar>
               <w:top w:type="dxa" w:w="50"/>
               <w:left w:type="dxa" w:w="110"/>
@@ -522,7 +522,7 @@
                 <w:sz w:val="18"/>
                 <w:szCs w:val="18"/>
               </w:rPr>
-              <w:t xml:space="preserve">components built; integration next</w:t>
+              <w:t xml:space="preserve">equations fit and banked; injection prototyped, not merged</w:t>
             </w:r>
           </w:p>
         </w:tc>
@@ -549,7 +549,7 @@
         <w:pStyle w:val="Heading2"/>
       </w:pPr>
       <w:r>
-        <w:t xml:space="preserve">Benchmark evidence</w:t>
+        <w:t xml:space="preserve">Implementation status, stated plainly</w:t>
       </w:r>
     </w:p>
     <w:p>
@@ -557,252 +557,23 @@
         <w:spacing w:after="140" w:line="276"/>
       </w:pPr>
       <w:r>
-        <w:t xml:space="preserve">On a clean Northeast benchmark (FIA remeasurement, with year-0 reproducing the observed stand state exactly), the calibrated engine is nearly unbiased on basal area where the native variants are not:</w:t>
-      </w:r>
-    </w:p>
-    <w:tbl>
-      <w:tblPr>
-        <w:tblW w:type="dxa" w:w="9360"/>
-        <w:tblBorders>
-          <w:top w:val="single" w:color="CCCCCC" w:sz="1"/>
-          <w:left w:val="single" w:color="CCCCCC" w:sz="1"/>
-          <w:bottom w:val="single" w:color="CCCCCC" w:sz="1"/>
-          <w:right w:val="single" w:color="CCCCCC" w:sz="1"/>
-          <w:insideH w:val="single" w:color="CCCCCC" w:sz="1"/>
-          <w:insideV w:val="single" w:color="CCCCCC" w:sz="1"/>
-        </w:tblBorders>
-      </w:tblPr>
-      <w:tblGrid>
-        <w:gridCol w:w="4680"/>
-        <w:gridCol w:w="2340"/>
-        <w:gridCol w:w="2340"/>
-      </w:tblGrid>
-      <w:tr>
-        <w:trPr>
-          <w:tblHeader/>
-        </w:trPr>
-        <w:tc>
-          <w:tcPr>
-            <w:tcW w:type="dxa" w:w="4680"/>
-            <w:shd w:fill="1A3D28" w:val="clear"/>
-            <w:tcMar>
-              <w:top w:type="dxa" w:w="60"/>
-              <w:left w:type="dxa" w:w="110"/>
-              <w:bottom w:type="dxa" w:w="60"/>
-              <w:right w:type="dxa" w:w="110"/>
-            </w:tcMar>
-          </w:tcPr>
-          <w:p>
-            <w:r>
-              <w:rPr>
-                <w:b/>
-                <w:bCs/>
-                <w:color w:val="FFFFFF"/>
-                <w:sz w:val="18"/>
-                <w:szCs w:val="18"/>
-              </w:rPr>
-              <w:t xml:space="preserve">Configuration</w:t>
-            </w:r>
-          </w:p>
-        </w:tc>
-        <w:tc>
-          <w:tcPr>
-            <w:tcW w:type="dxa" w:w="2340"/>
-            <w:shd w:fill="1A3D28" w:val="clear"/>
-            <w:tcMar>
-              <w:top w:type="dxa" w:w="60"/>
-              <w:left w:type="dxa" w:w="110"/>
-              <w:bottom w:type="dxa" w:w="60"/>
-              <w:right w:type="dxa" w:w="110"/>
-            </w:tcMar>
-          </w:tcPr>
-          <w:p>
-            <w:r>
-              <w:rPr>
-                <w:b/>
-                <w:bCs/>
-                <w:color w:val="FFFFFF"/>
-                <w:sz w:val="18"/>
-                <w:szCs w:val="18"/>
-              </w:rPr>
-              <w:t xml:space="preserve">Basal area bias</w:t>
-            </w:r>
-          </w:p>
-        </w:tc>
-        <w:tc>
-          <w:tcPr>
-            <w:tcW w:type="dxa" w:w="2340"/>
-            <w:shd w:fill="1A3D28" w:val="clear"/>
-            <w:tcMar>
-              <w:top w:type="dxa" w:w="60"/>
-              <w:left w:type="dxa" w:w="110"/>
-              <w:bottom w:type="dxa" w:w="60"/>
-              <w:right w:type="dxa" w:w="110"/>
-            </w:tcMar>
-          </w:tcPr>
-          <w:p>
-            <w:r>
-              <w:rPr>
-                <w:b/>
-                <w:bCs/>
-                <w:color w:val="FFFFFF"/>
-                <w:sz w:val="18"/>
-                <w:szCs w:val="18"/>
-              </w:rPr>
-              <w:t xml:space="preserve">Density</w:t>
-            </w:r>
-          </w:p>
-        </w:tc>
-      </w:tr>
-      <w:tr>
-        <w:tc>
-          <w:tcPr>
-            <w:tcW w:type="dxa" w:w="4680"/>
-            <w:tcMar>
-              <w:top w:type="dxa" w:w="50"/>
-              <w:left w:type="dxa" w:w="110"/>
-              <w:bottom w:type="dxa" w:w="50"/>
-              <w:right w:type="dxa" w:w="110"/>
-            </w:tcMar>
-          </w:tcPr>
-          <w:p>
-            <w:r>
-              <w:rPr>
-                <w:b w:val="false"/>
-                <w:bCs w:val="false"/>
-                <w:color w:val="333333"/>
-                <w:sz w:val="18"/>
-                <w:szCs w:val="18"/>
-              </w:rPr>
-              <w:t xml:space="preserve">Calibrated (FIA modifiers)</w:t>
-            </w:r>
-          </w:p>
-        </w:tc>
-        <w:tc>
-          <w:tcPr>
-            <w:tcW w:type="dxa" w:w="2340"/>
-            <w:tcMar>
-              <w:top w:type="dxa" w:w="50"/>
-              <w:left w:type="dxa" w:w="110"/>
-              <w:bottom w:type="dxa" w:w="50"/>
-              <w:right w:type="dxa" w:w="110"/>
-            </w:tcMar>
-          </w:tcPr>
-          <w:p>
-            <w:r>
-              <w:rPr>
-                <w:b/>
-                <w:bCs/>
-                <w:color w:val="1A3D28"/>
-                <w:sz w:val="18"/>
-                <w:szCs w:val="18"/>
-              </w:rPr>
-              <w:t xml:space="preserve">-0.6%</w:t>
-            </w:r>
-          </w:p>
-        </w:tc>
-        <w:tc>
-          <w:tcPr>
-            <w:tcW w:type="dxa" w:w="2340"/>
-            <w:tcMar>
-              <w:top w:type="dxa" w:w="50"/>
-              <w:left w:type="dxa" w:w="110"/>
-              <w:bottom w:type="dxa" w:w="50"/>
-              <w:right w:type="dxa" w:w="110"/>
-            </w:tcMar>
-          </w:tcPr>
-          <w:p>
-            <w:r>
-              <w:rPr>
-                <w:b w:val="false"/>
-                <w:bCs w:val="false"/>
-                <w:color w:val="333333"/>
-                <w:sz w:val="18"/>
-                <w:szCs w:val="18"/>
-              </w:rPr>
-              <w:t xml:space="preserve">the one weakness, traced to maximum SDI</w:t>
-            </w:r>
-          </w:p>
-        </w:tc>
-      </w:tr>
-      <w:tr>
-        <w:tc>
-          <w:tcPr>
-            <w:tcW w:type="dxa" w:w="4680"/>
-            <w:tcMar>
-              <w:top w:type="dxa" w:w="50"/>
-              <w:left w:type="dxa" w:w="110"/>
-              <w:bottom w:type="dxa" w:w="50"/>
-              <w:right w:type="dxa" w:w="110"/>
-            </w:tcMar>
-          </w:tcPr>
-          <w:p>
-            <w:r>
-              <w:rPr>
-                <w:b w:val="false"/>
-                <w:bCs w:val="false"/>
-                <w:color w:val="333333"/>
-                <w:sz w:val="18"/>
-                <w:szCs w:val="18"/>
-              </w:rPr>
-              <w:t xml:space="preserve">Native NE and ACD variants</w:t>
-            </w:r>
-          </w:p>
-        </w:tc>
-        <w:tc>
-          <w:tcPr>
-            <w:tcW w:type="dxa" w:w="2340"/>
-            <w:tcMar>
-              <w:top w:type="dxa" w:w="50"/>
-              <w:left w:type="dxa" w:w="110"/>
-              <w:bottom w:type="dxa" w:w="50"/>
-              <w:right w:type="dxa" w:w="110"/>
-            </w:tcMar>
-          </w:tcPr>
-          <w:p>
-            <w:r>
-              <w:rPr>
-                <w:b w:val="false"/>
-                <w:bCs w:val="false"/>
-                <w:color w:val="B0682F"/>
-                <w:sz w:val="18"/>
-                <w:szCs w:val="18"/>
-              </w:rPr>
-              <w:t xml:space="preserve">+12 to +13%</w:t>
-            </w:r>
-          </w:p>
-        </w:tc>
-        <w:tc>
-          <w:tcPr>
-            <w:tcW w:type="dxa" w:w="2340"/>
-            <w:tcMar>
-              <w:top w:type="dxa" w:w="50"/>
-              <w:left w:type="dxa" w:w="110"/>
-              <w:bottom w:type="dxa" w:w="50"/>
-              <w:right w:type="dxa" w:w="110"/>
-            </w:tcMar>
-          </w:tcPr>
-          <w:p>
-            <w:r>
-              <w:rPr>
-                <w:b w:val="false"/>
-                <w:bCs w:val="false"/>
-                <w:color w:val="333333"/>
-                <w:sz w:val="18"/>
-                <w:szCs w:val="18"/>
-              </w:rPr>
-              <w:t xml:space="preserve">-</w:t>
-            </w:r>
-          </w:p>
-        </w:tc>
-      </w:tr>
-    </w:tbl>
+        <w:t xml:space="preserve">The calibration framework is in place for all 25 variants, but coverage by component is uneven and worth stating exactly. Per-species mortality, crown ratio, and height-diameter multipliers are populated for all variants. Diameter-growth multipliers are populated for about seven variants and are still at unity (uncalibrated) for most, including the Northeast, Pacific Northwest, Southern, and Central Rockies. Height-growth multipliers are at unity for every variant. Completing the diameter- and height-growth calibration requires the per-variant component fits, which are queued. So Step 1 is deployed for mortality and the crown and height-diameter relationships across all variants, and partially complete for growth.</w:t>
+      </w:r>
+    </w:p>
+    <w:p>
+      <w:pPr>
+        <w:pStyle w:val="Heading2"/>
+      </w:pPr>
+      <w:r>
+        <w:t xml:space="preserve">Benchmark evidence (to be re-verified)</w:t>
+      </w:r>
+    </w:p>
     <w:p>
       <w:pPr>
         <w:spacing w:after="140" w:line="276"/>
       </w:pPr>
       <w:r>
-        <w:t xml:space="preserve">The basal area result is the headline: on the integral that matters most, the calibrated engine already beats the regional variants in the Northeast. The single remaining weakness, density, traces entirely to the maximum-SDI setting, which is the subject of Step 2.</w:t>
+        <w:t xml:space="preserve">On a clean Northeast benchmark (FIA remeasurement, with year-0 reproducing the observed stand state exactly), the calibrated engine was nearly unbiased on basal area where the native variants were not (about -0.6 percent versus +12 to +13 percent). This is encouraging but is a single region with modest sample size, and we are re-verifying it with an independent script and an explicit statement of which multipliers were active, after a benchmark harness issue (a fixed random seed) was found and fixed this session. We present it as a promising early signal, not a settled headline.</w:t>
       </w:r>
     </w:p>
     <w:p>
@@ -1257,7 +1028,7 @@
         <w:spacing w:after="140" w:line="276"/>
       </w:pPr>
       <w:r>
-        <w:t xml:space="preserve">The localized maximum predicts observed self-thinning better in every region, on the one criterion that is not circular.</w:t>
+        <w:t xml:space="preserve">The localized maximum predicts observed self-thinning better in every region, on the one criterion that is not circular. This is the most robust single result in the program. It should be read as a relative improvement on a weak signal: annual plot-level mortality is very noisy, so the absolute deviance explained is low (0.05 to 0.12), and the roughly 85 percent figure is the ratio of two small numbers, not a high-skill model. The direction and consistency across regions are solid; the magnitude framing is deliberately modest.</w:t>
       </w:r>
     </w:p>
     <w:p>
@@ -1445,7 +1216,7 @@
         <w:spacing w:after="140" w:line="276"/>
       </w:pPr>
       <w:r>
-        <w:t xml:space="preserve">Sweeping the level applied to the localized maximum through the real FVS mortality response, for every CONUS variant, the level-calibrated localized maximum matches or beats the native species-weighted maximum in 19 of the 20 variants (the lone exception is Utah), with the largest gains where the native level was most off. The optimal level is strongly variant-specific, spanning 0.6 to 2.0 with a median near 1.2: most variants need the brms maximum scaled up to match their native mortality, a few need it scaled down.</w:t>
+        <w:t xml:space="preserve">Sweeping the level applied to the localized maximum through the real FVS mortality response, for every CONUS variant, the level-calibrated localized maximum matched or beat the native species-weighted maximum in 19 of the 20 variants (the lone exception is Utah), and the optimal level was strongly variant-specific, spanning 0.6 to 2.0 with a median near 1.2. This is presented qualitatively, not as exact magnitudes: each variant is a single sample of roughly 80 to 140 plots, and a fixed random seed in the harness (found and fixed this session) means the per-variant numbers are not yet seed-consistent. The robust takeaways are the direction (calibration helps in nearly all variants) and the wide spread of required levels (no single global level works); the per-variant magnitudes await a multi-seed rerun.</w:t>
       </w:r>
     </w:p>
     <w:tbl>

</xml_diff>